<commit_message>
Regenerate report with full incident report, postmortem, and all reviewer fixes addressed
</commit_message>
<xml_diff>
--- a/Assignment_4_5_Report.docx
+++ b/Assignment_4_5_Report.docx
@@ -15,7 +15,7 @@
           <w:rFonts w:ascii="Calibri" w:hAnsi="Calibri"/>
           <w:b/>
           <w:color w:val="1F497D"/>
-          <w:sz w:val="44"/>
+          <w:sz w:val="48"/>
         </w:rPr>
         <w:t>ASSIGNMENT 4–5 REPORT</w:t>
       </w:r>
@@ -87,7 +87,7 @@
     </w:p>
     <w:p>
       <w:pPr>
-        <w:spacing w:before="280" w:after="80"/>
+        <w:spacing w:before="320" w:after="120"/>
       </w:pPr>
       <w:r>
         <w:rPr>
@@ -109,12 +109,12 @@
           <w:b w:val="0"/>
           <w:sz w:val="22"/>
         </w:rPr>
-        <w:t>MicroShop is a containerized e-commerce platform built to demonstrate SRE practices. It consists of five independent backend microservices, a PostgreSQL database, an Nginx frontend acting as a reverse proxy, Prometheus for metrics collection, and Grafana for visualization. All components run in Docker containers orchestrated by Docker Compose on a shared internal bridge network called microshop-net.</w:t>
+        <w:t>MicroShop is a containerized e-commerce platform built to demonstrate SRE practices. It consists of five independent FastAPI microservices, a PostgreSQL database, an Nginx frontend acting as a reverse proxy, Prometheus for metrics collection with alert rules, and Grafana with auto-provisioned dashboards. All components run in Docker containers orchestrated by Docker Compose on a shared internal bridge network (microshop-net).</w:t>
       </w:r>
     </w:p>
     <w:p>
       <w:pPr>
-        <w:spacing w:before="160" w:after="80"/>
+        <w:spacing w:before="200" w:after="80"/>
       </w:pPr>
       <w:r>
         <w:rPr>
@@ -137,7 +137,7 @@
           <w:b w:val="0"/>
           <w:sz w:val="22"/>
         </w:rPr>
-        <w:t>Auth Service (port 8001) — handles user login and returns a session token</w:t>
+        <w:t>Auth Service (port 8001) — JWT authentication with bcrypt password hashing; credentials from environment variables</w:t>
       </w:r>
     </w:p>
     <w:p>
@@ -151,7 +151,7 @@
           <w:b w:val="0"/>
           <w:sz w:val="22"/>
         </w:rPr>
-        <w:t>Product Service (port 8002) — serves the product catalog</w:t>
+        <w:t>Product Service (port 8002) — product catalog, persisted to a Docker volume via JSON file</w:t>
       </w:r>
     </w:p>
     <w:p>
@@ -165,7 +165,7 @@
           <w:b w:val="0"/>
           <w:sz w:val="22"/>
         </w:rPr>
-        <w:t>Order Service (port 8003) — manages orders, the only service with a PostgreSQL dependency</w:t>
+        <w:t>Order Service (port 8003) — order management, PostgreSQL backend; this is the incident target</w:t>
       </w:r>
     </w:p>
     <w:p>
@@ -179,7 +179,7 @@
           <w:b w:val="0"/>
           <w:sz w:val="22"/>
         </w:rPr>
-        <w:t>User Service (port 8004) — manages user profiles</w:t>
+        <w:t>User Service (port 8004) — user profile management</w:t>
       </w:r>
     </w:p>
     <w:p>
@@ -193,7 +193,7 @@
           <w:b w:val="0"/>
           <w:sz w:val="22"/>
         </w:rPr>
-        <w:t>Chat Service (port 8005) — handles user messaging</w:t>
+        <w:t>Chat Service (port 8005) — messaging with JWT token verification on all endpoints</w:t>
       </w:r>
     </w:p>
     <w:p>
@@ -221,7 +221,7 @@
           <w:b w:val="0"/>
           <w:sz w:val="22"/>
         </w:rPr>
-        <w:t>Prometheus (port 9090) — scrapes /metrics from all five services every 15 seconds; alert rules defined</w:t>
+        <w:t>Prometheus (port 9090) — scrapes /metrics from all five services; alert rules defined for error detection</w:t>
       </w:r>
     </w:p>
     <w:p>
@@ -235,7 +235,7 @@
           <w:b w:val="0"/>
           <w:sz w:val="22"/>
         </w:rPr>
-        <w:t>Grafana (port 3000) — visualizes Prometheus metrics (admin/admin)</w:t>
+        <w:t>Grafana (port 3000) — auto-provisioned datasource and dashboard on startup</w:t>
       </w:r>
     </w:p>
     <w:p>
@@ -249,12 +249,27 @@
           <w:b w:val="0"/>
           <w:sz w:val="22"/>
         </w:rPr>
-        <w:t>Nginx (port 80) — serves the frontend and proxies all API calls via /api/* routes</w:t>
+        <w:t>Nginx (port 80) — serves the frontend, proxies /api/* routes to backend services</w:t>
       </w:r>
     </w:p>
     <w:p>
       <w:pPr>
-        <w:spacing w:after="100"/>
+        <w:spacing w:before="200" w:after="80"/>
+      </w:pPr>
+      <w:r>
+        <w:rPr>
+          <w:rFonts w:ascii="Calibri" w:hAnsi="Calibri"/>
+          <w:b/>
+          <w:color w:val="1F497D"/>
+          <w:sz w:val="26"/>
+        </w:rPr>
+        <w:t>Security Hardening Applied</w:t>
+      </w:r>
+    </w:p>
+    <w:p>
+      <w:pPr>
+        <w:pStyle w:val="ListBullet"/>
+        <w:spacing w:after="40"/>
       </w:pPr>
       <w:r>
         <w:rPr>
@@ -262,12 +277,82 @@
           <w:b w:val="0"/>
           <w:sz w:val="22"/>
         </w:rPr>
-        <w:t>The frontend calls all backend services through Nginx proxy_pass routes (/api/auth/, /api/products/, /api/orders/, /api/users/, /api/chat/). This approach resolves browser CORS restrictions and keeps backend ports internal.</w:t>
+        <w:t>Auth credentials stored in .env file, never hardcoded in source code</w:t>
       </w:r>
     </w:p>
     <w:p>
       <w:pPr>
-        <w:spacing w:before="160" w:after="80"/>
+        <w:pStyle w:val="ListBullet"/>
+        <w:spacing w:after="40"/>
+      </w:pPr>
+      <w:r>
+        <w:rPr>
+          <w:rFonts w:ascii="Calibri" w:hAnsi="Calibri"/>
+          <w:b w:val="0"/>
+          <w:sz w:val="22"/>
+        </w:rPr>
+        <w:t>Passwords hashed with bcrypt — plaintext passwords never stored</w:t>
+      </w:r>
+    </w:p>
+    <w:p>
+      <w:pPr>
+        <w:pStyle w:val="ListBullet"/>
+        <w:spacing w:after="40"/>
+      </w:pPr>
+      <w:r>
+        <w:rPr>
+          <w:rFonts w:ascii="Calibri" w:hAnsi="Calibri"/>
+          <w:b w:val="0"/>
+          <w:sz w:val="22"/>
+        </w:rPr>
+        <w:t>Real JWT tokens (HS256) issued on login; Chat Service validates token on every request</w:t>
+      </w:r>
+    </w:p>
+    <w:p>
+      <w:pPr>
+        <w:pStyle w:val="ListBullet"/>
+        <w:spacing w:after="40"/>
+      </w:pPr>
+      <w:r>
+        <w:rPr>
+          <w:rFonts w:ascii="Calibri" w:hAnsi="Calibri"/>
+          <w:b w:val="0"/>
+          <w:sz w:val="22"/>
+        </w:rPr>
+        <w:t>All containers have memory and CPU resource limits (noisy-neighbor prevention)</w:t>
+      </w:r>
+    </w:p>
+    <w:p>
+      <w:pPr>
+        <w:pStyle w:val="ListBullet"/>
+        <w:spacing w:after="40"/>
+      </w:pPr>
+      <w:r>
+        <w:rPr>
+          <w:rFonts w:ascii="Calibri" w:hAnsi="Calibri"/>
+          <w:b w:val="0"/>
+          <w:sz w:val="22"/>
+        </w:rPr>
+        <w:t>Docker healthchecks defined for all FastAPI services and Nginx</w:t>
+      </w:r>
+    </w:p>
+    <w:p>
+      <w:pPr>
+        <w:pStyle w:val="ListBullet"/>
+        <w:spacing w:after="40"/>
+      </w:pPr>
+      <w:r>
+        <w:rPr>
+          <w:rFonts w:ascii="Calibri" w:hAnsi="Calibri"/>
+          <w:b w:val="0"/>
+          <w:sz w:val="22"/>
+        </w:rPr>
+        <w:t>terraform.tfstate excluded from git via .gitignore — contains sensitive AWS resource IDs</w:t>
+      </w:r>
+    </w:p>
+    <w:p>
+      <w:pPr>
+        <w:spacing w:before="200" w:after="80"/>
       </w:pPr>
       <w:r>
         <w:rPr>
@@ -290,7 +375,7 @@
           <w:b w:val="0"/>
           <w:sz w:val="22"/>
         </w:rPr>
-        <w:t>Auth service uses hardcoded users and returns a placeholder token — no real JWT implementation</w:t>
+        <w:t>Auth service uses two hardcoded users defined in .env — no user registration flow</w:t>
       </w:r>
     </w:p>
     <w:p>
@@ -304,7 +389,7 @@
           <w:b w:val="0"/>
           <w:sz w:val="22"/>
         </w:rPr>
-        <w:t>Product and Chat services use in-memory state — data resets on container restart</w:t>
+        <w:t>Chat messages are in-memory only — reset on container restart (no chat DB)</w:t>
       </w:r>
     </w:p>
     <w:p>
@@ -318,7 +403,7 @@
           <w:b w:val="0"/>
           <w:sz w:val="22"/>
         </w:rPr>
-        <w:t>Database credentials are hardcoded in docker-compose.yml — acceptable for a local assignment, not for production</w:t>
+        <w:t>Security group opens ports to 0.0.0.0/0 by default — the allowed_ssh_cidr variable allows restricting to a specific IP</w:t>
       </w:r>
     </w:p>
     <w:p>
@@ -332,12 +417,12 @@
           <w:b w:val="0"/>
           <w:sz w:val="22"/>
         </w:rPr>
-        <w:t>Security group opens all ports to 0.0.0.0/0 — sufficient for assignment demonstration, would be restricted in production</w:t>
+        <w:t>No SSH key pair configured for the EC2 instance — the ssh_key_name variable is available but left empty for this demo</w:t>
       </w:r>
     </w:p>
     <w:p>
       <w:pPr>
-        <w:spacing w:before="160" w:after="80"/>
+        <w:spacing w:before="200" w:after="80"/>
       </w:pPr>
       <w:r>
         <w:rPr>
@@ -459,7 +544,7 @@
     </w:p>
     <w:p>
       <w:pPr>
-        <w:spacing w:before="160" w:after="80"/>
+        <w:spacing w:before="200" w:after="80"/>
       </w:pPr>
       <w:r>
         <w:rPr>
@@ -481,7 +566,7 @@
           <w:b w:val="0"/>
           <w:sz w:val="22"/>
         </w:rPr>
-        <w:t>The MicroShop Dashboard shows real-time health of all five services. Green dots mean healthy. The dashboard fetches products from the Product Service and orders from the Order Service.</w:t>
+        <w:t>The MicroShop Dashboard shows real-time health of all five services with green/red status dots. The header includes a login form — entering credentials calls the Auth Service and receives a JWT token which is then used for authenticated Chat Service calls.</w:t>
       </w:r>
     </w:p>
     <w:p>
@@ -535,12 +620,12 @@
           <w:color w:val="787878"/>
           <w:sz w:val="18"/>
         </w:rPr>
-        <w:t>Figure: MicroShop Dashboard — all 5 services healthy (green dots)</w:t>
+        <w:t>Figure: MicroShop Dashboard — all 5 services healthy, login form in header</w:t>
       </w:r>
     </w:p>
     <w:p>
       <w:pPr>
-        <w:spacing w:before="160" w:after="80"/>
+        <w:spacing w:before="200" w:after="80"/>
       </w:pPr>
       <w:r>
         <w:rPr>
@@ -562,7 +647,7 @@
           <w:b w:val="0"/>
           <w:sz w:val="22"/>
         </w:rPr>
-        <w:t>Prometheus scrapes all five services at their /metrics endpoints. Alert rules are defined in alert_rules.yml — two alerts are configured: OrderServiceErrors (triggers when order_errors_total increases) and ServiceDown (triggers when any target becomes unreachable).</w:t>
+        <w:t>Prometheus scrapes all five services at their /metrics endpoints every 15 seconds. Two alert rules are defined in alert_rules.yml: OrderServiceErrors (fires when order_errors_total increases) and ServiceDown (fires when any target becomes unreachable). Grafana loads the Prometheus datasource and the MicroShop dashboard automatically on startup via provisioning files — no manual configuration needed.</w:t>
       </w:r>
     </w:p>
     <w:p>
@@ -670,7 +755,7 @@
           <w:color w:val="787878"/>
           <w:sz w:val="18"/>
         </w:rPr>
-        <w:t>Figure: Grafana — connected to Prometheus data source</w:t>
+        <w:t>Figure: Grafana — auto-provisioned dashboard with service health, request rates, and error panels</w:t>
       </w:r>
     </w:p>
     <w:p>
@@ -680,7 +765,7 @@
     </w:p>
     <w:p>
       <w:pPr>
-        <w:spacing w:before="280" w:after="80"/>
+        <w:spacing w:before="320" w:after="120"/>
       </w:pPr>
       <w:r>
         <w:rPr>
@@ -689,12 +774,12 @@
           <w:color w:val="1F497D"/>
           <w:sz w:val="32"/>
         </w:rPr>
-        <w:t>ASSIGNMENT 4 — Incident Response Simulation</w:t>
+        <w:t>ASSIGNMENT 4 — Incident Report</w:t>
       </w:r>
     </w:p>
     <w:p>
       <w:pPr>
-        <w:spacing w:before="160" w:after="80"/>
+        <w:spacing w:before="200" w:after="80"/>
       </w:pPr>
       <w:r>
         <w:rPr>
@@ -716,12 +801,12 @@
           <w:b w:val="0"/>
           <w:sz w:val="22"/>
         </w:rPr>
-        <w:t>A production-level incident was simulated in the Order Service by deliberately setting the DB_HOST environment variable to an invalid hostname ('wrong-host'). After restarting the container with this broken configuration, the Order Service lost all database connectivity and began returning HTTP 503 errors on every request. All other services remained fully operational throughout the incident.</w:t>
+        <w:t>On 2026-04-29, a production-level incident was simulated in the MicroShop Order Service by deliberately misconfiguring the DB_HOST environment variable from 'postgres' to 'wrong-host'. After restarting the container with this broken configuration, the Order Service lost all database connectivity and returned HTTP 503 on every request. All four other services remained fully operational throughout the incident, demonstrating correct fault isolation.</w:t>
       </w:r>
     </w:p>
     <w:p>
       <w:pPr>
-        <w:spacing w:before="160" w:after="80"/>
+        <w:spacing w:before="200" w:after="80"/>
       </w:pPr>
       <w:r>
         <w:rPr>
@@ -744,7 +829,7 @@
           <w:b w:val="0"/>
           <w:sz w:val="22"/>
         </w:rPr>
-        <w:t>Order Service: 100% unavailable — /orders and /health both returned HTTP 503</w:t>
+        <w:t>Order Service: 100% unavailable — /orders (GET and POST) and /health all returned HTTP 503</w:t>
       </w:r>
     </w:p>
     <w:p>
@@ -758,7 +843,7 @@
           <w:b w:val="0"/>
           <w:sz w:val="22"/>
         </w:rPr>
-        <w:t>Frontend dashboard: Order Service showed as 'Unreachable'</w:t>
+        <w:t>Frontend dashboard: Order Service card showed 'Unreachable' with red status dot</w:t>
       </w:r>
     </w:p>
     <w:p>
@@ -772,7 +857,7 @@
           <w:b w:val="0"/>
           <w:sz w:val="22"/>
         </w:rPr>
-        <w:t>Users could not view or create orders</w:t>
+        <w:t>Users could not view existing orders or create new ones</w:t>
       </w:r>
     </w:p>
     <w:p>
@@ -786,7 +871,7 @@
           <w:b w:val="0"/>
           <w:sz w:val="22"/>
         </w:rPr>
-        <w:t>Auth, Product, User, and Chat services: fully operational (fault isolation confirmed)</w:t>
+        <w:t>Auth, Product, User, and Chat services: fully operational — fault isolation confirmed</w:t>
       </w:r>
     </w:p>
     <w:p>
@@ -800,12 +885,26 @@
           <w:b w:val="0"/>
           <w:sz w:val="22"/>
         </w:rPr>
-        <w:t>Data integrity: no data was lost — PostgreSQL remained healthy throughout</w:t>
+        <w:t>Data integrity: no data was lost — PostgreSQL remained healthy throughout the incident</w:t>
       </w:r>
     </w:p>
     <w:p>
       <w:pPr>
-        <w:spacing w:before="160" w:after="80"/>
+        <w:pStyle w:val="ListBullet"/>
+        <w:spacing w:after="40"/>
+      </w:pPr>
+      <w:r>
+        <w:rPr>
+          <w:rFonts w:ascii="Calibri" w:hAnsi="Calibri"/>
+          <w:b w:val="0"/>
+          <w:sz w:val="22"/>
+        </w:rPr>
+        <w:t>Prometheus showed order-service as up=1 — the process was running but functionally broken</w:t>
+      </w:r>
+    </w:p>
+    <w:p>
+      <w:pPr>
+        <w:spacing w:before="200" w:after="80"/>
       </w:pPr>
       <w:r>
         <w:rPr>
@@ -827,12 +926,25 @@
           <w:b w:val="0"/>
           <w:sz w:val="22"/>
         </w:rPr>
-        <w:t>Severity: SEV-2 (Major) — a critical business function (order processing) was fully unavailable. Classified as SEV-2 rather than SEV-1 because the failure was isolated to one service and did not take down the entire platform.</w:t>
+        <w:t>Severity: SEV-2 (Major) — a critical business function (order processing) was completely unavailable.</w:t>
       </w:r>
     </w:p>
     <w:p>
       <w:pPr>
-        <w:spacing w:before="160" w:after="80"/>
+        <w:spacing w:after="100"/>
+      </w:pPr>
+      <w:r>
+        <w:rPr>
+          <w:rFonts w:ascii="Calibri" w:hAnsi="Calibri"/>
+          <w:b w:val="0"/>
+          <w:sz w:val="22"/>
+        </w:rPr>
+        <w:t>Classified SEV-2 rather than SEV-1 because the failure was isolated to one service and did not take down the entire platform. Authentication, product browsing, and other features remained functional.</w:t>
+      </w:r>
+    </w:p>
+    <w:p>
+      <w:pPr>
+        <w:spacing w:before="200" w:after="80"/>
       </w:pPr>
       <w:r>
         <w:rPr>
@@ -844,10 +956,451 @@
         <w:t>4. Timeline of Events</w:t>
       </w:r>
     </w:p>
+    <w:tbl>
+      <w:tblPr>
+        <w:tblStyle w:val="TableGrid"/>
+        <w:tblW w:type="auto" w:w="0"/>
+        <w:tblLook w:firstColumn="1" w:firstRow="1" w:lastColumn="0" w:lastRow="0" w:noHBand="0" w:noVBand="1" w:val="04A0"/>
+      </w:tblPr>
+      <w:tblGrid>
+        <w:gridCol w:w="4702"/>
+        <w:gridCol w:w="4702"/>
+      </w:tblGrid>
+      <w:tr>
+        <w:tc>
+          <w:tcPr>
+            <w:tcW w:type="dxa" w:w="4702"/>
+          </w:tcPr>
+          <w:p>
+            <w:r>
+              <w:rPr>
+                <w:rFonts w:ascii="Calibri" w:hAnsi="Calibri"/>
+                <w:b/>
+                <w:sz w:val="20"/>
+              </w:rPr>
+              <w:t>Time</w:t>
+            </w:r>
+          </w:p>
+        </w:tc>
+        <w:tc>
+          <w:tcPr>
+            <w:tcW w:type="dxa" w:w="4702"/>
+          </w:tcPr>
+          <w:p>
+            <w:r>
+              <w:rPr>
+                <w:rFonts w:ascii="Calibri" w:hAnsi="Calibri"/>
+                <w:b/>
+                <w:sz w:val="20"/>
+              </w:rPr>
+              <w:t>Event</w:t>
+            </w:r>
+          </w:p>
+        </w:tc>
+      </w:tr>
+      <w:tr>
+        <w:tc>
+          <w:tcPr>
+            <w:tcW w:type="dxa" w:w="4702"/>
+          </w:tcPr>
+          <w:p>
+            <w:r>
+              <w:rPr>
+                <w:rFonts w:ascii="Calibri" w:hAnsi="Calibri"/>
+                <w:b w:val="0"/>
+                <w:sz w:val="20"/>
+              </w:rPr>
+              <w:t>T+00:00</w:t>
+            </w:r>
+          </w:p>
+        </w:tc>
+        <w:tc>
+          <w:tcPr>
+            <w:tcW w:type="dxa" w:w="4702"/>
+          </w:tcPr>
+          <w:p>
+            <w:r>
+              <w:rPr>
+                <w:rFonts w:ascii="Calibri" w:hAnsi="Calibri"/>
+                <w:b w:val="0"/>
+                <w:sz w:val="20"/>
+              </w:rPr>
+              <w:t>DB_HOST changed from 'postgres' to 'wrong-host' in docker-compose.yml</w:t>
+            </w:r>
+          </w:p>
+        </w:tc>
+      </w:tr>
+      <w:tr>
+        <w:tc>
+          <w:tcPr>
+            <w:tcW w:type="dxa" w:w="4702"/>
+          </w:tcPr>
+          <w:p>
+            <w:r>
+              <w:rPr>
+                <w:rFonts w:ascii="Calibri" w:hAnsi="Calibri"/>
+                <w:b w:val="0"/>
+                <w:sz w:val="20"/>
+              </w:rPr>
+              <w:t>T+00:05</w:t>
+            </w:r>
+          </w:p>
+        </w:tc>
+        <w:tc>
+          <w:tcPr>
+            <w:tcW w:type="dxa" w:w="4702"/>
+          </w:tcPr>
+          <w:p>
+            <w:r>
+              <w:rPr>
+                <w:rFonts w:ascii="Calibri" w:hAnsi="Calibri"/>
+                <w:b w:val="0"/>
+                <w:sz w:val="20"/>
+              </w:rPr>
+              <w:t>Order Service restarted: docker compose up -d --force-recreate order-service</w:t>
+            </w:r>
+          </w:p>
+        </w:tc>
+      </w:tr>
+      <w:tr>
+        <w:tc>
+          <w:tcPr>
+            <w:tcW w:type="dxa" w:w="4702"/>
+          </w:tcPr>
+          <w:p>
+            <w:r>
+              <w:rPr>
+                <w:rFonts w:ascii="Calibri" w:hAnsi="Calibri"/>
+                <w:b w:val="0"/>
+                <w:sz w:val="20"/>
+              </w:rPr>
+              <w:t>T+00:10</w:t>
+            </w:r>
+          </w:p>
+        </w:tc>
+        <w:tc>
+          <w:tcPr>
+            <w:tcW w:type="dxa" w:w="4702"/>
+          </w:tcPr>
+          <w:p>
+            <w:r>
+              <w:rPr>
+                <w:rFonts w:ascii="Calibri" w:hAnsi="Calibri"/>
+                <w:b w:val="0"/>
+                <w:sz w:val="20"/>
+              </w:rPr>
+              <w:t>Frontend dashboard detected Order Service as 'Unreachable'</w:t>
+            </w:r>
+          </w:p>
+        </w:tc>
+      </w:tr>
+      <w:tr>
+        <w:tc>
+          <w:tcPr>
+            <w:tcW w:type="dxa" w:w="4702"/>
+          </w:tcPr>
+          <w:p>
+            <w:r>
+              <w:rPr>
+                <w:rFonts w:ascii="Calibri" w:hAnsi="Calibri"/>
+                <w:b w:val="0"/>
+                <w:sz w:val="20"/>
+              </w:rPr>
+              <w:t>T+00:15</w:t>
+            </w:r>
+          </w:p>
+        </w:tc>
+        <w:tc>
+          <w:tcPr>
+            <w:tcW w:type="dxa" w:w="4702"/>
+          </w:tcPr>
+          <w:p>
+            <w:r>
+              <w:rPr>
+                <w:rFonts w:ascii="Calibri" w:hAnsi="Calibri"/>
+                <w:b w:val="0"/>
+                <w:sz w:val="20"/>
+              </w:rPr>
+              <w:t>/api/orders/orders returned HTTP 503 Service Unavailable</w:t>
+            </w:r>
+          </w:p>
+        </w:tc>
+      </w:tr>
+      <w:tr>
+        <w:tc>
+          <w:tcPr>
+            <w:tcW w:type="dxa" w:w="4702"/>
+          </w:tcPr>
+          <w:p>
+            <w:r>
+              <w:rPr>
+                <w:rFonts w:ascii="Calibri" w:hAnsi="Calibri"/>
+                <w:b w:val="0"/>
+                <w:sz w:val="20"/>
+              </w:rPr>
+              <w:t>T+00:20</w:t>
+            </w:r>
+          </w:p>
+        </w:tc>
+        <w:tc>
+          <w:tcPr>
+            <w:tcW w:type="dxa" w:w="4702"/>
+          </w:tcPr>
+          <w:p>
+            <w:r>
+              <w:rPr>
+                <w:rFonts w:ascii="Calibri" w:hAnsi="Calibri"/>
+                <w:b w:val="0"/>
+                <w:sz w:val="20"/>
+              </w:rPr>
+              <w:t>order_errors_total counter began incrementing in Prometheus</w:t>
+            </w:r>
+          </w:p>
+        </w:tc>
+      </w:tr>
+      <w:tr>
+        <w:tc>
+          <w:tcPr>
+            <w:tcW w:type="dxa" w:w="4702"/>
+          </w:tcPr>
+          <w:p>
+            <w:r>
+              <w:rPr>
+                <w:rFonts w:ascii="Calibri" w:hAnsi="Calibri"/>
+                <w:b w:val="0"/>
+                <w:sz w:val="20"/>
+              </w:rPr>
+              <w:t>T+00:25</w:t>
+            </w:r>
+          </w:p>
+        </w:tc>
+        <w:tc>
+          <w:tcPr>
+            <w:tcW w:type="dxa" w:w="4702"/>
+          </w:tcPr>
+          <w:p>
+            <w:r>
+              <w:rPr>
+                <w:rFonts w:ascii="Calibri" w:hAnsi="Calibri"/>
+                <w:b w:val="0"/>
+                <w:sz w:val="20"/>
+              </w:rPr>
+              <w:t>/health returned 503: 'DB connection failed: could not translate host name wrong-host'</w:t>
+            </w:r>
+          </w:p>
+        </w:tc>
+      </w:tr>
+      <w:tr>
+        <w:tc>
+          <w:tcPr>
+            <w:tcW w:type="dxa" w:w="4702"/>
+          </w:tcPr>
+          <w:p>
+            <w:r>
+              <w:rPr>
+                <w:rFonts w:ascii="Calibri" w:hAnsi="Calibri"/>
+                <w:b w:val="0"/>
+                <w:sz w:val="20"/>
+              </w:rPr>
+              <w:t>T+00:30</w:t>
+            </w:r>
+          </w:p>
+        </w:tc>
+        <w:tc>
+          <w:tcPr>
+            <w:tcW w:type="dxa" w:w="4702"/>
+          </w:tcPr>
+          <w:p>
+            <w:r>
+              <w:rPr>
+                <w:rFonts w:ascii="Calibri" w:hAnsi="Calibri"/>
+                <w:b w:val="0"/>
+                <w:sz w:val="20"/>
+              </w:rPr>
+              <w:t>docker logs confirmed repeated psycopg2 DNS resolution failures</w:t>
+            </w:r>
+          </w:p>
+        </w:tc>
+      </w:tr>
+      <w:tr>
+        <w:tc>
+          <w:tcPr>
+            <w:tcW w:type="dxa" w:w="4702"/>
+          </w:tcPr>
+          <w:p>
+            <w:r>
+              <w:rPr>
+                <w:rFonts w:ascii="Calibri" w:hAnsi="Calibri"/>
+                <w:b w:val="0"/>
+                <w:sz w:val="20"/>
+              </w:rPr>
+              <w:t>T+01:00</w:t>
+            </w:r>
+          </w:p>
+        </w:tc>
+        <w:tc>
+          <w:tcPr>
+            <w:tcW w:type="dxa" w:w="4702"/>
+          </w:tcPr>
+          <w:p>
+            <w:r>
+              <w:rPr>
+                <w:rFonts w:ascii="Calibri" w:hAnsi="Calibri"/>
+                <w:b w:val="0"/>
+                <w:sz w:val="20"/>
+              </w:rPr>
+              <w:t>Root cause confirmed: incorrect DB_HOST environment variable</w:t>
+            </w:r>
+          </w:p>
+        </w:tc>
+      </w:tr>
+      <w:tr>
+        <w:tc>
+          <w:tcPr>
+            <w:tcW w:type="dxa" w:w="4702"/>
+          </w:tcPr>
+          <w:p>
+            <w:r>
+              <w:rPr>
+                <w:rFonts w:ascii="Calibri" w:hAnsi="Calibri"/>
+                <w:b w:val="0"/>
+                <w:sz w:val="20"/>
+              </w:rPr>
+              <w:t>T+01:05</w:t>
+            </w:r>
+          </w:p>
+        </w:tc>
+        <w:tc>
+          <w:tcPr>
+            <w:tcW w:type="dxa" w:w="4702"/>
+          </w:tcPr>
+          <w:p>
+            <w:r>
+              <w:rPr>
+                <w:rFonts w:ascii="Calibri" w:hAnsi="Calibri"/>
+                <w:b w:val="0"/>
+                <w:sz w:val="20"/>
+              </w:rPr>
+              <w:t>DB_HOST corrected back to 'postgres' in docker-compose.yml</w:t>
+            </w:r>
+          </w:p>
+        </w:tc>
+      </w:tr>
+      <w:tr>
+        <w:tc>
+          <w:tcPr>
+            <w:tcW w:type="dxa" w:w="4702"/>
+          </w:tcPr>
+          <w:p>
+            <w:r>
+              <w:rPr>
+                <w:rFonts w:ascii="Calibri" w:hAnsi="Calibri"/>
+                <w:b w:val="0"/>
+                <w:sz w:val="20"/>
+              </w:rPr>
+              <w:t>T+01:10</w:t>
+            </w:r>
+          </w:p>
+        </w:tc>
+        <w:tc>
+          <w:tcPr>
+            <w:tcW w:type="dxa" w:w="4702"/>
+          </w:tcPr>
+          <w:p>
+            <w:r>
+              <w:rPr>
+                <w:rFonts w:ascii="Calibri" w:hAnsi="Calibri"/>
+                <w:b w:val="0"/>
+                <w:sz w:val="20"/>
+              </w:rPr>
+              <w:t>Order Service restarted with corrected configuration</w:t>
+            </w:r>
+          </w:p>
+        </w:tc>
+      </w:tr>
+      <w:tr>
+        <w:tc>
+          <w:tcPr>
+            <w:tcW w:type="dxa" w:w="4702"/>
+          </w:tcPr>
+          <w:p>
+            <w:r>
+              <w:rPr>
+                <w:rFonts w:ascii="Calibri" w:hAnsi="Calibri"/>
+                <w:b w:val="0"/>
+                <w:sz w:val="20"/>
+              </w:rPr>
+              <w:t>T+01:15</w:t>
+            </w:r>
+          </w:p>
+        </w:tc>
+        <w:tc>
+          <w:tcPr>
+            <w:tcW w:type="dxa" w:w="4702"/>
+          </w:tcPr>
+          <w:p>
+            <w:r>
+              <w:rPr>
+                <w:rFonts w:ascii="Calibri" w:hAnsi="Calibri"/>
+                <w:b w:val="0"/>
+                <w:sz w:val="20"/>
+              </w:rPr>
+              <w:t>/health returned HTTP 200: {status: ok, db: connected}</w:t>
+            </w:r>
+          </w:p>
+        </w:tc>
+      </w:tr>
+      <w:tr>
+        <w:tc>
+          <w:tcPr>
+            <w:tcW w:type="dxa" w:w="4702"/>
+          </w:tcPr>
+          <w:p>
+            <w:r>
+              <w:rPr>
+                <w:rFonts w:ascii="Calibri" w:hAnsi="Calibri"/>
+                <w:b w:val="0"/>
+                <w:sz w:val="20"/>
+              </w:rPr>
+              <w:t>T+01:20</w:t>
+            </w:r>
+          </w:p>
+        </w:tc>
+        <w:tc>
+          <w:tcPr>
+            <w:tcW w:type="dxa" w:w="4702"/>
+          </w:tcPr>
+          <w:p>
+            <w:r>
+              <w:rPr>
+                <w:rFonts w:ascii="Calibri" w:hAnsi="Calibri"/>
+                <w:b w:val="0"/>
+                <w:sz w:val="20"/>
+              </w:rPr>
+              <w:t>Frontend dashboard confirmed all services green — full recovery</w:t>
+            </w:r>
+          </w:p>
+        </w:tc>
+      </w:tr>
+    </w:tbl>
+    <w:p/>
     <w:p>
       <w:pPr>
-        <w:pStyle w:val="ListBullet"/>
-        <w:spacing w:after="40"/>
+        <w:spacing w:before="200" w:after="80"/>
+      </w:pPr>
+      <w:r>
+        <w:rPr>
+          <w:rFonts w:ascii="Calibri" w:hAnsi="Calibri"/>
+          <w:b/>
+          <w:color w:val="1F497D"/>
+          <w:sz w:val="26"/>
+        </w:rPr>
+        <w:t>5. Root Cause Analysis</w:t>
+      </w:r>
+    </w:p>
+    <w:p>
+      <w:pPr>
+        <w:spacing w:after="100"/>
       </w:pPr>
       <w:r>
         <w:rPr>
@@ -855,13 +1408,12 @@
           <w:b w:val="0"/>
           <w:sz w:val="22"/>
         </w:rPr>
-        <w:t>T+00:00 — DB_HOST changed from 'postgres' to 'wrong-host' in docker-compose.yml</w:t>
+        <w:t>Root cause: misconfigured DB_HOST environment variable. Docker Compose services resolve each other by container name through Docker's internal DNS. The hostname 'postgres' resolves correctly on the microshop-net network because a container with that name exists. The value 'wrong-host' has no DNS record on the network, so every call to psycopg2.connect() immediately raised an OperationalError at the DNS resolution step — before even attempting a TCP connection to port 5432.</w:t>
       </w:r>
     </w:p>
     <w:p>
       <w:pPr>
-        <w:pStyle w:val="ListBullet"/>
-        <w:spacing w:after="40"/>
+        <w:spacing w:after="100"/>
       </w:pPr>
       <w:r>
         <w:rPr>
@@ -869,152 +1421,12 @@
           <w:b w:val="0"/>
           <w:sz w:val="22"/>
         </w:rPr>
-        <w:t>T+00:05 — Order Service restarted: docker compose up -d --force-recreate order-service</w:t>
+        <w:t>Key SRE observation: Prometheus showed order-service as up=1 throughout the entire incident. This is because Prometheus scrapes /metrics, which does not touch the database and always responds successfully. The service process was alive, but functionally broken. This demonstrates a critical distinction in SRE: process liveness does not equal service health. The /health endpoint (which calls psycopg2.connect() on every request) correctly returned 503 and provided the exact error message pointing to the bad hostname.</w:t>
       </w:r>
     </w:p>
     <w:p>
       <w:pPr>
-        <w:pStyle w:val="ListBullet"/>
-        <w:spacing w:after="40"/>
-      </w:pPr>
-      <w:r>
-        <w:rPr>
-          <w:rFonts w:ascii="Calibri" w:hAnsi="Calibri"/>
-          <w:b w:val="0"/>
-          <w:sz w:val="22"/>
-        </w:rPr>
-        <w:t>T+00:10 — Frontend dashboard detected Order Service as 'Unreachable'</w:t>
-      </w:r>
-    </w:p>
-    <w:p>
-      <w:pPr>
-        <w:pStyle w:val="ListBullet"/>
-        <w:spacing w:after="40"/>
-      </w:pPr>
-      <w:r>
-        <w:rPr>
-          <w:rFonts w:ascii="Calibri" w:hAnsi="Calibri"/>
-          <w:b w:val="0"/>
-          <w:sz w:val="22"/>
-        </w:rPr>
-        <w:t>T+00:15 — /orders endpoint began returning HTTP 503</w:t>
-      </w:r>
-    </w:p>
-    <w:p>
-      <w:pPr>
-        <w:pStyle w:val="ListBullet"/>
-        <w:spacing w:after="40"/>
-      </w:pPr>
-      <w:r>
-        <w:rPr>
-          <w:rFonts w:ascii="Calibri" w:hAnsi="Calibri"/>
-          <w:b w:val="0"/>
-          <w:sz w:val="22"/>
-        </w:rPr>
-        <w:t>T+00:20 — order_errors_total counter started incrementing in Prometheus</w:t>
-      </w:r>
-    </w:p>
-    <w:p>
-      <w:pPr>
-        <w:pStyle w:val="ListBullet"/>
-        <w:spacing w:after="40"/>
-      </w:pPr>
-      <w:r>
-        <w:rPr>
-          <w:rFonts w:ascii="Calibri" w:hAnsi="Calibri"/>
-          <w:b w:val="0"/>
-          <w:sz w:val="22"/>
-        </w:rPr>
-        <w:t>T+00:25 — /health returned 503: 'DB connection failed: could not translate host name wrong-host'</w:t>
-      </w:r>
-    </w:p>
-    <w:p>
-      <w:pPr>
-        <w:pStyle w:val="ListBullet"/>
-        <w:spacing w:after="40"/>
-      </w:pPr>
-      <w:r>
-        <w:rPr>
-          <w:rFonts w:ascii="Calibri" w:hAnsi="Calibri"/>
-          <w:b w:val="0"/>
-          <w:sz w:val="22"/>
-        </w:rPr>
-        <w:t>T+00:30 — Docker logs confirmed: repeated psycopg2 connection errors to wrong-host:5432</w:t>
-      </w:r>
-    </w:p>
-    <w:p>
-      <w:pPr>
-        <w:pStyle w:val="ListBullet"/>
-        <w:spacing w:after="40"/>
-      </w:pPr>
-      <w:r>
-        <w:rPr>
-          <w:rFonts w:ascii="Calibri" w:hAnsi="Calibri"/>
-          <w:b w:val="0"/>
-          <w:sz w:val="22"/>
-        </w:rPr>
-        <w:t>T+01:00 — Root cause identified: incorrect DB_HOST value in environment config</w:t>
-      </w:r>
-    </w:p>
-    <w:p>
-      <w:pPr>
-        <w:pStyle w:val="ListBullet"/>
-        <w:spacing w:after="40"/>
-      </w:pPr>
-      <w:r>
-        <w:rPr>
-          <w:rFonts w:ascii="Calibri" w:hAnsi="Calibri"/>
-          <w:b w:val="0"/>
-          <w:sz w:val="22"/>
-        </w:rPr>
-        <w:t>T+01:05 — DB_HOST corrected back to 'postgres' in docker-compose.yml</w:t>
-      </w:r>
-    </w:p>
-    <w:p>
-      <w:pPr>
-        <w:pStyle w:val="ListBullet"/>
-        <w:spacing w:after="40"/>
-      </w:pPr>
-      <w:r>
-        <w:rPr>
-          <w:rFonts w:ascii="Calibri" w:hAnsi="Calibri"/>
-          <w:b w:val="0"/>
-          <w:sz w:val="22"/>
-        </w:rPr>
-        <w:t>T+01:10 — Order Service restarted with corrected configuration</w:t>
-      </w:r>
-    </w:p>
-    <w:p>
-      <w:pPr>
-        <w:pStyle w:val="ListBullet"/>
-        <w:spacing w:after="40"/>
-      </w:pPr>
-      <w:r>
-        <w:rPr>
-          <w:rFonts w:ascii="Calibri" w:hAnsi="Calibri"/>
-          <w:b w:val="0"/>
-          <w:sz w:val="22"/>
-        </w:rPr>
-        <w:t>T+01:15 — /health returned HTTP 200: db: connected</w:t>
-      </w:r>
-    </w:p>
-    <w:p>
-      <w:pPr>
-        <w:pStyle w:val="ListBullet"/>
-        <w:spacing w:after="40"/>
-      </w:pPr>
-      <w:r>
-        <w:rPr>
-          <w:rFonts w:ascii="Calibri" w:hAnsi="Calibri"/>
-          <w:b w:val="0"/>
-          <w:sz w:val="22"/>
-        </w:rPr>
-        <w:t>T+01:20 — Frontend dashboard: all services green, full recovery confirmed</w:t>
-      </w:r>
-    </w:p>
-    <w:p>
-      <w:pPr>
-        <w:spacing w:before="160" w:after="80"/>
+        <w:spacing w:before="200" w:after="80"/>
       </w:pPr>
       <w:r>
         <w:rPr>
@@ -1077,7 +1489,7 @@
           <w:color w:val="787878"/>
           <w:sz w:val="18"/>
         </w:rPr>
-        <w:t>Figure: Dashboard during incident — Order Service 'Unreachable', 503 errors visible in browser Network tab</w:t>
+        <w:t>Figure: Dashboard during incident — Order Service 'Unreachable', 503 errors visible in Network tab</w:t>
       </w:r>
     </w:p>
     <w:p>
@@ -1131,7 +1543,7 @@
           <w:color w:val="787878"/>
           <w:sz w:val="18"/>
         </w:rPr>
-        <w:t>Figure: Prometheus during incident — note: /metrics endpoint still responded (service process was running), but /health showed DB failure. This demonstrates a key SRE lesson: a service can be 'up' in Prometheus but functionally broken — process liveness ≠ service health.</w:t>
+        <w:t>Figure: Prometheus during incident — up=1 for all services including order-service. The process is alive but /metrics does not check DB. The real signal is order_errors_total.</w:t>
       </w:r>
     </w:p>
     <w:p>
@@ -1185,7 +1597,7 @@
           <w:color w:val="787878"/>
           <w:sz w:val="18"/>
         </w:rPr>
-        <w:t>Figure: Docker logs — repeated DB connection errors: could not translate host name 'wrong-host'</w:t>
+        <w:t>Figure: Docker logs — alternating pattern: GET /orders → 503, GET /metrics → 200. Confirms service is running but every DB request fails.</w:t>
       </w:r>
     </w:p>
     <w:p>
@@ -1239,52 +1651,12 @@
           <w:color w:val="787878"/>
           <w:sz w:val="18"/>
         </w:rPr>
-        <w:t>Figure: /health returning 503 and order_errors_total incrementing in /metrics</w:t>
+        <w:t>Figure: /health returning 503 with exact error: 'could not translate host name wrong-host' — this is the root cause evidence. Right panel shows order_errors_total incrementing.</w:t>
       </w:r>
     </w:p>
     <w:p>
       <w:pPr>
-        <w:spacing w:before="160" w:after="80"/>
-      </w:pPr>
-      <w:r>
-        <w:rPr>
-          <w:rFonts w:ascii="Calibri" w:hAnsi="Calibri"/>
-          <w:b/>
-          <w:color w:val="1F497D"/>
-          <w:sz w:val="26"/>
-        </w:rPr>
-        <w:t>5. Root Cause Analysis</w:t>
-      </w:r>
-    </w:p>
-    <w:p>
-      <w:pPr>
-        <w:spacing w:after="100"/>
-      </w:pPr>
-      <w:r>
-        <w:rPr>
-          <w:rFonts w:ascii="Calibri" w:hAnsi="Calibri"/>
-          <w:b w:val="0"/>
-          <w:sz w:val="22"/>
-        </w:rPr>
-        <w:t>Root cause: misconfigured DB_HOST environment variable. Docker Compose services resolve each other by container name on the internal network. The container name 'postgres' resolves correctly via Docker DNS. The value 'wrong-host' has no DNS record on the microshop-net network, so every call to psycopg2.connect() immediately raised an OperationalError. The service has no retry logic — each request attempted a fresh connection with a 3-second timeout, failed, incremented order_errors_total, and returned 503.</w:t>
-      </w:r>
-    </w:p>
-    <w:p>
-      <w:pPr>
-        <w:spacing w:after="100"/>
-      </w:pPr>
-      <w:r>
-        <w:rPr>
-          <w:rFonts w:ascii="Calibri" w:hAnsi="Calibri"/>
-          <w:b w:val="0"/>
-          <w:sz w:val="22"/>
-        </w:rPr>
-        <w:t>Secondary observation: Prometheus showed the service as UP during the incident because the /metrics endpoint (which does not touch the database) continued to respond. This highlights why dependency health checks in /health endpoints are essential — they expose functional failures that raw process liveness cannot detect.</w:t>
-      </w:r>
-    </w:p>
-    <w:p>
-      <w:pPr>
-        <w:spacing w:before="160" w:after="80"/>
+        <w:spacing w:before="200" w:after="80"/>
       </w:pPr>
       <w:r>
         <w:rPr>
@@ -1307,7 +1679,7 @@
           <w:b w:val="0"/>
           <w:sz w:val="22"/>
         </w:rPr>
-        <w:t>Identified the failing container: docker logs order-service</w:t>
+        <w:t>Step 1 — Identified failing container: docker logs order-service showed repeated 503 on /orders</w:t>
       </w:r>
     </w:p>
     <w:p>
@@ -1321,7 +1693,7 @@
           <w:b w:val="0"/>
           <w:sz w:val="22"/>
         </w:rPr>
-        <w:t>Confirmed the bad value: inspected DB_HOST in docker-compose.yml</w:t>
+        <w:t>Step 2 — Checked /health endpoint: returned exact error message with the bad hostname 'wrong-host'</w:t>
       </w:r>
     </w:p>
     <w:p>
@@ -1335,7 +1707,7 @@
           <w:b w:val="0"/>
           <w:sz w:val="22"/>
         </w:rPr>
-        <w:t>Applied fix: changed DB_HOST back to 'postgres'</w:t>
+        <w:t>Step 3 — Inspected docker-compose.yml: found DB_HOST set to 'wrong-host' instead of 'postgres'</w:t>
       </w:r>
     </w:p>
     <w:p>
@@ -1349,7 +1721,7 @@
           <w:b w:val="0"/>
           <w:sz w:val="22"/>
         </w:rPr>
-        <w:t>Restarted only the affected container: docker compose up -d --force-recreate order-service</w:t>
+        <w:t>Step 4 — Applied fix: changed DB_HOST back to 'postgres'</w:t>
       </w:r>
     </w:p>
     <w:p>
@@ -1363,12 +1735,40 @@
           <w:b w:val="0"/>
           <w:sz w:val="22"/>
         </w:rPr>
-        <w:t>Verified via /health endpoint and frontend dashboard</w:t>
+        <w:t>Step 5 — Restarted only the affected container: docker compose up -d --force-recreate order-service</w:t>
       </w:r>
     </w:p>
     <w:p>
       <w:pPr>
-        <w:spacing w:before="160" w:after="80"/>
+        <w:pStyle w:val="ListBullet"/>
+        <w:spacing w:after="40"/>
+      </w:pPr>
+      <w:r>
+        <w:rPr>
+          <w:rFonts w:ascii="Calibri" w:hAnsi="Calibri"/>
+          <w:b w:val="0"/>
+          <w:sz w:val="22"/>
+        </w:rPr>
+        <w:t>Step 6 — Verified recovery: /health returned 200 with db: connected</w:t>
+      </w:r>
+    </w:p>
+    <w:p>
+      <w:pPr>
+        <w:pStyle w:val="ListBullet"/>
+        <w:spacing w:after="40"/>
+      </w:pPr>
+      <w:r>
+        <w:rPr>
+          <w:rFonts w:ascii="Calibri" w:hAnsi="Calibri"/>
+          <w:b w:val="0"/>
+          <w:sz w:val="22"/>
+        </w:rPr>
+        <w:t>Step 7 — Confirmed via dashboard: all services showing green</w:t>
+      </w:r>
+    </w:p>
+    <w:p>
+      <w:pPr>
+        <w:spacing w:before="200" w:after="80"/>
       </w:pPr>
       <w:r>
         <w:rPr>
@@ -1390,7 +1790,7 @@
           <w:b w:val="0"/>
           <w:sz w:val="22"/>
         </w:rPr>
-        <w:t>Full recovery achieved within ~70 seconds of applying the fix. The /health endpoint returned HTTP 200 with db: connected, the frontend showed all green, and the order_errors_total counter stopped incrementing.</w:t>
+        <w:t>Full recovery was achieved within approximately 70 seconds of applying the fix. The /health endpoint returned HTTP 200 with db: connected, the frontend dashboard showed all five services green, and the order_errors_total counter stopped incrementing in Prometheus. No data was lost and no other services required any intervention.</w:t>
       </w:r>
     </w:p>
     <w:p>
@@ -1498,7 +1898,7 @@
           <w:color w:val="787878"/>
           <w:sz w:val="18"/>
         </w:rPr>
-        <w:t>Figure: Recovery logs — HTTP 200 responses confirmed after fix</w:t>
+        <w:t>Figure: Recovery logs — HTTP 200 responses on /orders confirmed after fix</w:t>
       </w:r>
     </w:p>
     <w:p>
@@ -1562,7 +1962,7 @@
     </w:p>
     <w:p>
       <w:pPr>
-        <w:spacing w:before="280" w:after="80"/>
+        <w:spacing w:before="320" w:after="120"/>
       </w:pPr>
       <w:r>
         <w:rPr>
@@ -1576,7 +1976,7 @@
     </w:p>
     <w:p>
       <w:pPr>
-        <w:spacing w:before="160" w:after="80"/>
+        <w:spacing w:before="200" w:after="80"/>
       </w:pPr>
       <w:r>
         <w:rPr>
@@ -1598,12 +1998,12 @@
           <w:b w:val="0"/>
           <w:sz w:val="22"/>
         </w:rPr>
-        <w:t>On 2026-04-29, the MicroShop Order Service became fully unavailable for approximately 70 seconds due to an incorrect database hostname in the service environment configuration. The incident was intentionally introduced as part of Assignment 4 to simulate a realistic production failure and practice the full incident response cycle.</w:t>
+        <w:t>On 2026-04-29, the MicroShop Order Service became fully unavailable for approximately 70 seconds due to an incorrect database hostname in the service environment configuration. The incident was intentionally introduced as part of Assignment 4 to simulate a realistic production failure and practice the complete incident response lifecycle — detection, analysis, mitigation, and recovery.</w:t>
       </w:r>
     </w:p>
     <w:p>
       <w:pPr>
-        <w:spacing w:before="160" w:after="80"/>
+        <w:spacing w:before="200" w:after="80"/>
       </w:pPr>
       <w:r>
         <w:rPr>
@@ -1626,7 +2026,7 @@
           <w:b w:val="0"/>
           <w:sz w:val="22"/>
         </w:rPr>
-        <w:t>100% of order-related requests failed with HTTP 503 during the incident window</w:t>
+        <w:t>100% of order-related requests (view orders, create order) failed with HTTP 503</w:t>
       </w:r>
     </w:p>
     <w:p>
@@ -1640,7 +2040,7 @@
           <w:b w:val="0"/>
           <w:sz w:val="22"/>
         </w:rPr>
-        <w:t>Order viewing and creation were completely unavailable</w:t>
+        <w:t>The MicroShop frontend showed Order Service as 'Unreachable' for the duration of the incident</w:t>
       </w:r>
     </w:p>
     <w:p>
@@ -1654,7 +2054,7 @@
           <w:b w:val="0"/>
           <w:sz w:val="22"/>
         </w:rPr>
-        <w:t>Product browsing, authentication, user profiles, and chat were unaffected</w:t>
+        <w:t>No data loss occurred — PostgreSQL remained healthy and all existing orders were preserved</w:t>
       </w:r>
     </w:p>
     <w:p>
@@ -1668,12 +2068,26 @@
           <w:b w:val="0"/>
           <w:sz w:val="22"/>
         </w:rPr>
-        <w:t>No data loss — PostgreSQL remained healthy and all existing orders were preserved</w:t>
+        <w:t>Product browsing, authentication, user profiles, and chat were fully unaffected</w:t>
       </w:r>
     </w:p>
     <w:p>
       <w:pPr>
-        <w:spacing w:before="160" w:after="80"/>
+        <w:pStyle w:val="ListBullet"/>
+        <w:spacing w:after="40"/>
+      </w:pPr>
+      <w:r>
+        <w:rPr>
+          <w:rFonts w:ascii="Calibri" w:hAnsi="Calibri"/>
+          <w:b w:val="0"/>
+          <w:sz w:val="22"/>
+        </w:rPr>
+        <w:t>In a real production environment this would represent complete loss of revenue-generating functionality</w:t>
+      </w:r>
+    </w:p>
+    <w:p>
+      <w:pPr>
+        <w:spacing w:before="200" w:after="80"/>
       </w:pPr>
       <w:r>
         <w:rPr>
@@ -1695,12 +2109,25 @@
           <w:b w:val="0"/>
           <w:sz w:val="22"/>
         </w:rPr>
-        <w:t>The DB_HOST environment variable was manually set to a non-existent hostname. In Docker Compose, services discover each other through Docker's internal DNS using container names as hostnames. When DB_HOST='wrong-host', every database call failed at the DNS resolution step before even attempting a TCP connection to PostgreSQL. The service had no retry mechanism or connection pooling, so failures were immediate and total.</w:t>
+        <w:t>The DB_HOST environment variable was manually changed to a non-existent hostname. In Docker Compose, services discover each other by container name via Docker's internal DNS. Setting DB_HOST='wrong-host' caused immediate DNS lookup failure on every database operation. The service had no connection retry logic — each incoming request attempted a fresh psycopg2.connect() with a 3-second timeout, failed instantly, incremented order_errors_total, and returned HTTP 503.</w:t>
       </w:r>
     </w:p>
     <w:p>
       <w:pPr>
-        <w:spacing w:before="160" w:after="80"/>
+        <w:spacing w:after="100"/>
+      </w:pPr>
+      <w:r>
+        <w:rPr>
+          <w:rFonts w:ascii="Calibri" w:hAnsi="Calibri"/>
+          <w:b w:val="0"/>
+          <w:sz w:val="22"/>
+        </w:rPr>
+        <w:t>Contributing factor: Prometheus monitoring showed the service as UP throughout the incident because it only checks /metrics endpoint availability (process liveness), not actual DB connectivity (functional health). This created a misleading signal that could delay detection in a real environment without proper alerting on error rates.</w:t>
+      </w:r>
+    </w:p>
+    <w:p>
+      <w:pPr>
+        <w:spacing w:before="200" w:after="80"/>
       </w:pPr>
       <w:r>
         <w:rPr>
@@ -1722,7 +2149,7 @@
           <w:b w:val="0"/>
           <w:sz w:val="22"/>
         </w:rPr>
-        <w:t>Detection was fast — the frontend dashboard showed the failure within 10 seconds of the restart, and the /health endpoint provided an exact error message pointing to the bad hostname. Prometheus metrics confirmed the error pattern through order_errors_total.</w:t>
+        <w:t>Detection was fast — the frontend dashboard showed the failure within 10 seconds of the container restart. The /health endpoint was the critical diagnostic tool: it provided the exact error message including the bad hostname, making root cause identification immediate.</w:t>
       </w:r>
     </w:p>
     <w:p>
@@ -1735,12 +2162,12 @@
           <w:b w:val="0"/>
           <w:sz w:val="22"/>
         </w:rPr>
-        <w:t>One gap identified: Prometheus showed the service as UP throughout because it scrapes /metrics, which does not require a database connection. In a production environment, Prometheus alert rules should monitor both process liveness (up) and functional health (via health check endpoints or error rate thresholds). The OrderServiceErrors alert rule added to alert_rules.yml directly addresses this.</w:t>
+        <w:t>Gap identified: Prometheus showed up=1 during the incident. In production, relying solely on process liveness metrics would delay detection. The OrderServiceErrors alert rule added to alert_rules.yml addresses this — it fires when order_errors_total increases, catching functional failures that process liveness cannot detect.</w:t>
       </w:r>
     </w:p>
     <w:p>
       <w:pPr>
-        <w:spacing w:before="160" w:after="80"/>
+        <w:spacing w:before="200" w:after="80"/>
       </w:pPr>
       <w:r>
         <w:rPr>
@@ -1762,12 +2189,12 @@
           <w:b w:val="0"/>
           <w:sz w:val="22"/>
         </w:rPr>
-        <w:t>A single configuration change (correcting DB_HOST to 'postgres') followed by a container restart fully restored the service. Resolution time: under 2 minutes. No code changes, no data recovery, and no other services required any intervention.</w:t>
+        <w:t>A single configuration change (correcting DB_HOST to 'postgres') followed by a container restart fully restored the service in under 2 minutes. No code changes, no data recovery, and no other service required any intervention. The microservices fault isolation architecture worked exactly as designed.</w:t>
       </w:r>
     </w:p>
     <w:p>
       <w:pPr>
-        <w:spacing w:before="160" w:after="80"/>
+        <w:spacing w:before="200" w:after="80"/>
       </w:pPr>
       <w:r>
         <w:rPr>
@@ -1790,7 +2217,7 @@
           <w:b w:val="0"/>
           <w:sz w:val="22"/>
         </w:rPr>
-        <w:t>Environment variables are a common and dangerous source of misconfiguration in containerized systems</w:t>
+        <w:t>Environment variables are a frequent source of misconfiguration — they should be validated at service startup</w:t>
       </w:r>
     </w:p>
     <w:p>
@@ -1804,7 +2231,7 @@
           <w:b w:val="0"/>
           <w:sz w:val="22"/>
         </w:rPr>
-        <w:t>A service being 'up' in Prometheus does not mean it is functionally healthy — dependency checks matter</w:t>
+        <w:t>Process liveness (up=1 in Prometheus) does not mean a service is functionally healthy</w:t>
       </w:r>
     </w:p>
     <w:p>
@@ -1818,7 +2245,7 @@
           <w:b w:val="0"/>
           <w:sz w:val="22"/>
         </w:rPr>
-        <w:t>The /health endpoint design (checking actual DB connectivity) was correct and proved essential for diagnosis</w:t>
+        <w:t>Dependency health checks in /health endpoints are essential — they reveal failures that Prometheus scraping misses</w:t>
       </w:r>
     </w:p>
     <w:p>
@@ -1832,7 +2259,7 @@
           <w:b w:val="0"/>
           <w:sz w:val="22"/>
         </w:rPr>
-        <w:t>Microservices fault isolation worked as designed — one broken service did not cascade</w:t>
+        <w:t>Microservices fault isolation worked correctly — a broken Order Service did not cascade to other services</w:t>
       </w:r>
     </w:p>
     <w:p>
@@ -1846,12 +2273,26 @@
           <w:b w:val="0"/>
           <w:sz w:val="22"/>
         </w:rPr>
-        <w:t>Manual changes to running service configuration should always be validated before applying</w:t>
+        <w:t>The /health endpoint design (checking actual DB connectivity on every call) was the correct approach and proved essential</w:t>
       </w:r>
     </w:p>
     <w:p>
       <w:pPr>
-        <w:spacing w:before="160" w:after="80"/>
+        <w:pStyle w:val="ListBullet"/>
+        <w:spacing w:after="40"/>
+      </w:pPr>
+      <w:r>
+        <w:rPr>
+          <w:rFonts w:ascii="Calibri" w:hAnsi="Calibri"/>
+          <w:b w:val="0"/>
+          <w:sz w:val="22"/>
+        </w:rPr>
+        <w:t>Manual changes to running configurations should always be validated before applying in production</w:t>
+      </w:r>
+    </w:p>
+    <w:p>
+      <w:pPr>
+        <w:spacing w:before="200" w:after="80"/>
       </w:pPr>
       <w:r>
         <w:rPr>
@@ -1888,7 +2329,7 @@
           <w:b w:val="0"/>
           <w:sz w:val="22"/>
         </w:rPr>
-        <w:t>Add startup validation to Order Service — fail fast with a clear error if DB_HOST cannot be resolved at boot</w:t>
+        <w:t>DONE — Grafana dashboard auto-provisioned with error rate panels visible during incident</w:t>
       </w:r>
     </w:p>
     <w:p>
@@ -1902,7 +2343,7 @@
           <w:b w:val="0"/>
           <w:sz w:val="22"/>
         </w:rPr>
-        <w:t>Implement connection retry with exponential backoff in psycopg2 calls</w:t>
+        <w:t>DONE — Resource limits and Docker healthchecks added to all containers</w:t>
       </w:r>
     </w:p>
     <w:p>
@@ -1916,7 +2357,7 @@
           <w:b w:val="0"/>
           <w:sz w:val="22"/>
         </w:rPr>
-        <w:t>Add Grafana alerting channel (email/Slack) connected to Prometheus alerts</w:t>
+        <w:t>TODO — Add DB_HOST validation at Order Service startup: attempt connection and fail fast with clear error</w:t>
       </w:r>
     </w:p>
     <w:p>
@@ -1930,7 +2371,7 @@
           <w:b w:val="0"/>
           <w:sz w:val="22"/>
         </w:rPr>
-        <w:t>Replace hardcoded DB credentials in docker-compose.yml with a .env file</w:t>
+        <w:t>TODO — Implement connection retry with exponential backoff in psycopg2 calls</w:t>
       </w:r>
     </w:p>
     <w:p>
@@ -1944,7 +2385,21 @@
           <w:b w:val="0"/>
           <w:sz w:val="22"/>
         </w:rPr>
-        <w:t>Add healthcheck blocks to FastAPI service containers in docker-compose.yml</w:t>
+        <w:t>TODO — Configure Grafana alert notification channel (email/Slack) connected to Prometheus alerts</w:t>
+      </w:r>
+    </w:p>
+    <w:p>
+      <w:pPr>
+        <w:pStyle w:val="ListBullet"/>
+        <w:spacing w:after="40"/>
+      </w:pPr>
+      <w:r>
+        <w:rPr>
+          <w:rFonts w:ascii="Calibri" w:hAnsi="Calibri"/>
+          <w:b w:val="0"/>
+          <w:sz w:val="22"/>
+        </w:rPr>
+        <w:t>TODO — Replace 0.0.0.0/0 in Terraform security group with specific IP ranges in production</w:t>
       </w:r>
     </w:p>
     <w:p>
@@ -1954,7 +2409,7 @@
     </w:p>
     <w:p>
       <w:pPr>
-        <w:spacing w:before="280" w:after="80"/>
+        <w:spacing w:before="320" w:after="120"/>
       </w:pPr>
       <w:r>
         <w:rPr>
@@ -1968,7 +2423,7 @@
     </w:p>
     <w:p>
       <w:pPr>
-        <w:spacing w:before="160" w:after="80"/>
+        <w:spacing w:before="200" w:after="80"/>
       </w:pPr>
       <w:r>
         <w:rPr>
@@ -1990,12 +2445,12 @@
           <w:b w:val="0"/>
           <w:sz w:val="22"/>
         </w:rPr>
-        <w:t>The cloud infrastructure for MicroShop was provisioned using Terraform with the AWS provider. Terraform is a declarative IaC tool — infrastructure is described in .tf files and created, updated, or destroyed with single commands. This makes infrastructure reproducible, version-controlled, and auditable, unlike manual AWS Console clicks.</w:t>
+        <w:t>The cloud infrastructure for MicroShop was provisioned using Terraform with the AWS provider. Terraform is a declarative IaC tool — the entire infrastructure is described in .tf files and created, updated, or destroyed with single commands. This makes infrastructure reproducible, version-controlled, and auditable — unlike manual AWS Console operations.</w:t>
       </w:r>
     </w:p>
     <w:p>
       <w:pPr>
-        <w:spacing w:before="160" w:after="80"/>
+        <w:spacing w:before="200" w:after="80"/>
       </w:pPr>
       <w:r>
         <w:rPr>
@@ -2004,7 +2459,7 @@
           <w:color w:val="1F497D"/>
           <w:sz w:val="26"/>
         </w:rPr>
-        <w:t>Implementation Note: Two Phases</w:t>
+        <w:t>Implementation: Two Phases</w:t>
       </w:r>
     </w:p>
     <w:p>
@@ -2017,7 +2472,7 @@
           <w:b w:val="0"/>
           <w:sz w:val="22"/>
         </w:rPr>
-        <w:t>During development, Terraform was first configured with a local Docker provider (kreuzwerker/docker) to provision containers locally. This was later replaced with the AWS provider after the professor confirmed cloud deployment was required. The screenshots labeled 13_terraform_apply_* show the Docker provider phase. The screenshots labeled 14_terraform_apply_after_AWS_implementation_* show the final AWS deployment that created a real EC2 instance.</w:t>
+        <w:t>During development, Terraform was first configured with a local Docker provider (kreuzwerker/docker) to validate the configuration structure locally. This phase is visible in screenshots 13_terraform_apply_*. After the professor confirmed that cloud deployment was required, the configuration was migrated to the AWS provider. The final AWS deployment is shown in screenshots 14_terraform_apply_after_AWS_implementation_*. The code in the repository reflects the final AWS configuration only.</w:t>
       </w:r>
     </w:p>
     <w:p>
@@ -2029,15 +2484,15 @@
         <w:rPr>
           <w:rFonts w:ascii="Calibri" w:hAnsi="Calibri"/>
           <w:b w:val="0"/>
-          <w:color w:val="646464"/>
+          <w:color w:val="505050"/>
           <w:sz w:val="20"/>
         </w:rPr>
-        <w:t>The Terraform code in the repository (main.tf) reflects the final AWS configuration only. The AWS apply created: EC2 instance at 34.238.137.187, security group sg-0091acf407323802f.</w:t>
+        <w:t>Note: The AWS apply created: EC2 instance at 34.238.137.187 (us-east-1), security group sg-0091acf407323802f. The Docker provider files were removed from state before the AWS migration.</w:t>
       </w:r>
     </w:p>
     <w:p>
       <w:pPr>
-        <w:spacing w:before="160" w:after="80"/>
+        <w:spacing w:before="200" w:after="80"/>
       </w:pPr>
       <w:r>
         <w:rPr>
@@ -2051,14 +2506,14 @@
     </w:p>
     <w:p>
       <w:pPr>
-        <w:spacing w:before="160" w:after="80"/>
+        <w:spacing w:before="160" w:after="40"/>
       </w:pPr>
       <w:r>
         <w:rPr>
           <w:rFonts w:ascii="Calibri" w:hAnsi="Calibri"/>
           <w:b/>
           <w:color w:val="000000"/>
-          <w:sz w:val="24"/>
+          <w:sz w:val="22"/>
         </w:rPr>
         <w:t>main.tf</w:t>
       </w:r>
@@ -2073,19 +2528,19 @@
           <w:b w:val="0"/>
           <w:sz w:val="22"/>
         </w:rPr>
-        <w:t>Defines two AWS resources. First, aws_security_group creates a firewall with inbound rules for SSH (22), HTTP (80), Grafana (3000), and Prometheus (9090), with all outbound traffic allowed. Second, aws_instance provisions a t3.micro EC2 virtual machine using the Amazon Linux 2 AMI. The user_data script runs on first boot and installs Docker, so the application can be deployed immediately after the instance starts.</w:t>
+        <w:t>Defines two AWS resources. aws_security_group creates a firewall with inbound rules for SSH (22), HTTP (80), Grafana (3000), and Prometheus (9090). SSH and monitoring ports use the allowed_ssh_cidr variable — set it to your IP in production to restrict access. aws_instance provisions a t3.micro EC2 VM with Amazon Linux 2. The user_data script runs on first boot and installs Docker, git, and docker-compose so the application can be deployed immediately after the instance starts. The key_name field accepts an AWS key pair name via the ssh_key_name variable — left empty for this demo but required for SSH access in a real deployment.</w:t>
       </w:r>
     </w:p>
     <w:p>
       <w:pPr>
-        <w:spacing w:before="160" w:after="80"/>
+        <w:spacing w:before="160" w:after="40"/>
       </w:pPr>
       <w:r>
         <w:rPr>
           <w:rFonts w:ascii="Calibri" w:hAnsi="Calibri"/>
           <w:b/>
           <w:color w:val="000000"/>
-          <w:sz w:val="24"/>
+          <w:sz w:val="22"/>
         </w:rPr>
         <w:t>variables.tf</w:t>
       </w:r>
@@ -2100,19 +2555,19 @@
           <w:b w:val="0"/>
           <w:sz w:val="22"/>
         </w:rPr>
-        <w:t>Declares three input variables: aws_region, instance_type, and ami_id. Using variables instead of hardcoded values makes the configuration reusable — changing the region or instance size requires editing only terraform.tfvars.</w:t>
+        <w:t>Declares five input variables: aws_region, instance_type, ami_id, allowed_ssh_cidr, and ssh_key_name. Using variables instead of hardcoded values makes the configuration reusable — changing the region, instance size, or IP restrictions requires editing only terraform.tfvars, not the core infrastructure code.</w:t>
       </w:r>
     </w:p>
     <w:p>
       <w:pPr>
-        <w:spacing w:before="160" w:after="80"/>
+        <w:spacing w:before="160" w:after="40"/>
       </w:pPr>
       <w:r>
         <w:rPr>
           <w:rFonts w:ascii="Calibri" w:hAnsi="Calibri"/>
           <w:b/>
           <w:color w:val="000000"/>
-          <w:sz w:val="24"/>
+          <w:sz w:val="22"/>
         </w:rPr>
         <w:t>terraform.tfvars</w:t>
       </w:r>
@@ -2127,19 +2582,19 @@
           <w:b w:val="0"/>
           <w:sz w:val="22"/>
         </w:rPr>
-        <w:t>Provides the actual values: us-east-1, t3.micro, ami-0c02fb55956c7d316 (Amazon Linux 2 for us-east-1). t3.micro was chosen because it is free-tier eligible — t2.micro was initially used but was rejected by AWS as not free-tier eligible in the selected region.</w:t>
+        <w:t>Provides actual values: us-east-1, t3.micro, Amazon Linux 2 AMI. t3.micro was chosen because t2.micro was rejected by AWS as not free-tier eligible in the selected region. Includes comments explaining how to restrict access in production.</w:t>
       </w:r>
     </w:p>
     <w:p>
       <w:pPr>
-        <w:spacing w:before="160" w:after="80"/>
+        <w:spacing w:before="160" w:after="40"/>
       </w:pPr>
       <w:r>
         <w:rPr>
           <w:rFonts w:ascii="Calibri" w:hAnsi="Calibri"/>
           <w:b/>
           <w:color w:val="000000"/>
-          <w:sz w:val="24"/>
+          <w:sz w:val="22"/>
         </w:rPr>
         <w:t>outputs.tf</w:t>
       </w:r>
@@ -2154,12 +2609,82 @@
           <w:b w:val="0"/>
           <w:sz w:val="22"/>
         </w:rPr>
-        <w:t>Defines what Terraform prints after apply: instance_public_ip, instance_public_dns, grafana_url (http://&lt;ip&gt;:3000), prometheus_url (http://&lt;ip&gt;:9090), and security_group_id. These outputs make it easy to access deployed services without looking up the IP manually.</w:t>
+        <w:t>Defines what Terraform prints after apply: instance_public_ip, instance_public_dns, grafana_url, prometheus_url, and security_group_id. These make it easy to access deployed services without looking up the IP manually in the AWS Console.</w:t>
       </w:r>
     </w:p>
     <w:p>
       <w:pPr>
-        <w:spacing w:before="160" w:after="80"/>
+        <w:spacing w:before="200" w:after="80"/>
+      </w:pPr>
+      <w:r>
+        <w:rPr>
+          <w:rFonts w:ascii="Calibri" w:hAnsi="Calibri"/>
+          <w:b/>
+          <w:color w:val="1F497D"/>
+          <w:sz w:val="26"/>
+        </w:rPr>
+        <w:t>Security Considerations</w:t>
+      </w:r>
+    </w:p>
+    <w:p>
+      <w:pPr>
+        <w:pStyle w:val="ListBullet"/>
+        <w:spacing w:after="40"/>
+      </w:pPr>
+      <w:r>
+        <w:rPr>
+          <w:rFonts w:ascii="Calibri" w:hAnsi="Calibri"/>
+          <w:b w:val="0"/>
+          <w:sz w:val="22"/>
+        </w:rPr>
+        <w:t>SSH and monitoring ports use allowed_ssh_cidr variable — defaults to 0.0.0.0/0 for demo, restrict to specific IP in production</w:t>
+      </w:r>
+    </w:p>
+    <w:p>
+      <w:pPr>
+        <w:pStyle w:val="ListBullet"/>
+        <w:spacing w:after="40"/>
+      </w:pPr>
+      <w:r>
+        <w:rPr>
+          <w:rFonts w:ascii="Calibri" w:hAnsi="Calibri"/>
+          <w:b w:val="0"/>
+          <w:sz w:val="22"/>
+        </w:rPr>
+        <w:t>No SSH key pair configured by default — set ssh_key_name variable to an existing AWS key pair to enable SSH access</w:t>
+      </w:r>
+    </w:p>
+    <w:p>
+      <w:pPr>
+        <w:pStyle w:val="ListBullet"/>
+        <w:spacing w:after="40"/>
+      </w:pPr>
+      <w:r>
+        <w:rPr>
+          <w:rFonts w:ascii="Calibri" w:hAnsi="Calibri"/>
+          <w:b w:val="0"/>
+          <w:sz w:val="22"/>
+        </w:rPr>
+        <w:t>Grafana and Prometheus have no built-in auth when exposed publicly — in production place behind a VPN or add authentication</w:t>
+      </w:r>
+    </w:p>
+    <w:p>
+      <w:pPr>
+        <w:pStyle w:val="ListBullet"/>
+        <w:spacing w:after="40"/>
+      </w:pPr>
+      <w:r>
+        <w:rPr>
+          <w:rFonts w:ascii="Calibri" w:hAnsi="Calibri"/>
+          <w:b w:val="0"/>
+          <w:sz w:val="22"/>
+        </w:rPr>
+        <w:t>terraform.tfstate is excluded from git via .gitignore — it contains AWS resource IDs and should never be committed</w:t>
+      </w:r>
+    </w:p>
+    <w:p>
+      <w:pPr>
+        <w:spacing w:before="200" w:after="80"/>
       </w:pPr>
       <w:r>
         <w:rPr>
@@ -2182,7 +2707,7 @@
           <w:b w:val="0"/>
           <w:sz w:val="22"/>
         </w:rPr>
-        <w:t>terraform init — downloads the hashicorp/aws provider plugin, initializes the working directory</w:t>
+        <w:t>terraform init — downloads hashicorp/aws provider plugin, initializes working directory</w:t>
       </w:r>
     </w:p>
     <w:p>
@@ -2196,7 +2721,7 @@
           <w:b w:val="0"/>
           <w:sz w:val="22"/>
         </w:rPr>
-        <w:t>terraform plan — previews all changes before applying; shows exact resources to be created</w:t>
+        <w:t>terraform plan — previews all changes; shows exact resources to be created before any AWS calls</w:t>
       </w:r>
     </w:p>
     <w:p>
@@ -2224,12 +2749,12 @@
           <w:b w:val="0"/>
           <w:sz w:val="22"/>
         </w:rPr>
-        <w:t>terraform destroy — removes all provisioned resources cleanly to avoid ongoing AWS charges</w:t>
+        <w:t>terraform destroy — removes all resources cleanly; always run after assignment to avoid AWS charges</w:t>
       </w:r>
     </w:p>
     <w:p>
       <w:pPr>
-        <w:spacing w:before="160" w:after="80"/>
+        <w:spacing w:before="200" w:after="80"/>
       </w:pPr>
       <w:r>
         <w:rPr>
@@ -2346,7 +2871,7 @@
           <w:color w:val="787878"/>
           <w:sz w:val="18"/>
         </w:rPr>
-        <w:t>Figure: AWS IAM credentials configured for Terraform authentication</w:t>
+        <w:t>Figure: AWS IAM credentials configured via access key for Terraform authentication</w:t>
       </w:r>
     </w:p>
     <w:p>
@@ -2454,7 +2979,7 @@
           <w:color w:val="787878"/>
           <w:sz w:val="18"/>
         </w:rPr>
-        <w:t>Figure: terraform plan — EC2 instance configuration detail (AMI, instance type, user_data)</w:t>
+        <w:t>Figure: terraform plan — EC2 instance details: AMI, instance type, security group, user_data</w:t>
       </w:r>
     </w:p>
     <w:p>
@@ -2508,7 +3033,7 @@
           <w:color w:val="787878"/>
           <w:sz w:val="18"/>
         </w:rPr>
-        <w:t>Figure: terraform apply (AWS) — EC2 instance creation in progress</w:t>
+        <w:t>Figure: terraform apply (AWS) — EC2 instance creation in progress on AWS</w:t>
       </w:r>
     </w:p>
     <w:p>
@@ -2562,7 +3087,7 @@
           <w:color w:val="787878"/>
           <w:sz w:val="18"/>
         </w:rPr>
-        <w:t>Figure: terraform apply (AWS) — resources created: security group sg-0091acf407323802f</w:t>
+        <w:t>Figure: terraform apply (AWS) — security group sg-0091acf407323802f created</w:t>
       </w:r>
     </w:p>
     <w:p>
@@ -2621,7 +3146,7 @@
     </w:p>
     <w:p>
       <w:pPr>
-        <w:spacing w:before="160" w:after="80"/>
+        <w:spacing w:before="200" w:after="80"/>
       </w:pPr>
       <w:r>
         <w:rPr>
@@ -2658,7 +3183,7 @@
           <w:b w:val="0"/>
           <w:sz w:val="22"/>
         </w:rPr>
-        <w:t>Version controlled — infrastructure changes are tracked in git alongside application code</w:t>
+        <w:t>Version controlled — infrastructure changes tracked in git alongside application code</w:t>
       </w:r>
     </w:p>
     <w:p>
@@ -2672,7 +3197,7 @@
           <w:b w:val="0"/>
           <w:sz w:val="22"/>
         </w:rPr>
-        <w:t>Documented — .tf files are human-readable and self-documenting</w:t>
+        <w:t>Self-documenting — .tf files describe exactly what exists and why</w:t>
       </w:r>
     </w:p>
     <w:p>
@@ -2686,7 +3211,7 @@
           <w:b w:val="0"/>
           <w:sz w:val="22"/>
         </w:rPr>
-        <w:t>Automated — no manual clicking, no typos, no forgotten steps</w:t>
+        <w:t>Automated — no manual clicking, no missed steps, no human error</w:t>
       </w:r>
     </w:p>
     <w:p>
@@ -2700,7 +3225,7 @@
           <w:b w:val="0"/>
           <w:sz w:val="22"/>
         </w:rPr>
-        <w:t>Destroyable — terraform destroy cleanly removes all resources, preventing surprise AWS charges</w:t>
+        <w:t>Destroyable — terraform destroy cleanly removes everything, preventing surprise AWS charges</w:t>
       </w:r>
     </w:p>
     <w:p>
@@ -2710,7 +3235,7 @@
     </w:p>
     <w:p>
       <w:pPr>
-        <w:spacing w:before="280" w:after="80"/>
+        <w:spacing w:before="320" w:after="120"/>
       </w:pPr>
       <w:r>
         <w:rPr>
@@ -2724,7 +3249,7 @@
     </w:p>
     <w:p>
       <w:pPr>
-        <w:spacing w:before="160" w:after="80"/>
+        <w:spacing w:before="200" w:after="80"/>
       </w:pPr>
       <w:r>
         <w:rPr>
@@ -2775,7 +3300,7 @@
           <w:b w:val="0"/>
           <w:sz w:val="22"/>
         </w:rPr>
-        <w:t>AWS account with IAM user (access key + secret key, AdministratorAccess policy)</w:t>
+        <w:t>AWS account with IAM user (AdministratorAccess policy, access key + secret key)</w:t>
       </w:r>
     </w:p>
     <w:p>
@@ -2794,7 +3319,7 @@
     </w:p>
     <w:p>
       <w:pPr>
-        <w:spacing w:before="160" w:after="80"/>
+        <w:spacing w:before="200" w:after="80"/>
       </w:pPr>
       <w:r>
         <w:rPr>
@@ -2834,7 +3359,7 @@
     </w:p>
     <w:p>
       <w:pPr>
-        <w:spacing w:before="160" w:after="80"/>
+        <w:spacing w:before="200" w:after="80"/>
       </w:pPr>
       <w:r>
         <w:rPr>
@@ -2843,7 +3368,47 @@
           <w:color w:val="1F497D"/>
           <w:sz w:val="26"/>
         </w:rPr>
-        <w:t>2. Run the Application Locally</w:t>
+        <w:t>2. Configure Environment</w:t>
+      </w:r>
+    </w:p>
+    <w:p>
+      <w:pPr>
+        <w:spacing w:after="100"/>
+      </w:pPr>
+      <w:r>
+        <w:rPr>
+          <w:rFonts w:ascii="Calibri" w:hAnsi="Calibri"/>
+          <w:b w:val="0"/>
+          <w:sz w:val="22"/>
+        </w:rPr>
+        <w:t>cp .env.example .env</w:t>
+      </w:r>
+    </w:p>
+    <w:p>
+      <w:pPr>
+        <w:spacing w:after="100"/>
+      </w:pPr>
+      <w:r>
+        <w:rPr>
+          <w:rFonts w:ascii="Calibri" w:hAnsi="Calibri"/>
+          <w:b w:val="0"/>
+          <w:sz w:val="22"/>
+        </w:rPr>
+        <w:t>Edit .env and set your preferred passwords and JWT secret.</w:t>
+      </w:r>
+    </w:p>
+    <w:p>
+      <w:pPr>
+        <w:spacing w:before="200" w:after="80"/>
+      </w:pPr>
+      <w:r>
+        <w:rPr>
+          <w:rFonts w:ascii="Calibri" w:hAnsi="Calibri"/>
+          <w:b/>
+          <w:color w:val="1F497D"/>
+          <w:sz w:val="26"/>
+        </w:rPr>
+        <w:t>3. Run Locally with Docker Compose</w:t>
       </w:r>
     </w:p>
     <w:p>
@@ -2869,12 +3434,25 @@
           <w:b w:val="0"/>
           <w:sz w:val="22"/>
         </w:rPr>
-        <w:t>Dashboard: http://localhost:80  |  Prometheus: http://localhost:9090  |  Grafana: http://localhost:3000 (admin/admin)</w:t>
+        <w:t>Dashboard: http://localhost:80  |  Prometheus: http://localhost:9090  |  Grafana: http://localhost:3000</w:t>
       </w:r>
     </w:p>
     <w:p>
       <w:pPr>
-        <w:spacing w:before="160" w:after="80"/>
+        <w:spacing w:after="100"/>
+      </w:pPr>
+      <w:r>
+        <w:rPr>
+          <w:rFonts w:ascii="Calibri" w:hAnsi="Calibri"/>
+          <w:b w:val="0"/>
+          <w:sz w:val="22"/>
+        </w:rPr>
+        <w:t>Login with credentials from .env (default: nurzhan / password123).</w:t>
+      </w:r>
+    </w:p>
+    <w:p>
+      <w:pPr>
+        <w:spacing w:before="200" w:after="80"/>
       </w:pPr>
       <w:r>
         <w:rPr>
@@ -2883,7 +3461,7 @@
           <w:color w:val="1F497D"/>
           <w:sz w:val="26"/>
         </w:rPr>
-        <w:t>3. Provision AWS Infrastructure</w:t>
+        <w:t>4. Provision AWS Infrastructure</w:t>
       </w:r>
     </w:p>
     <w:p>
@@ -2909,7 +3487,7 @@
           <w:b w:val="0"/>
           <w:sz w:val="22"/>
         </w:rPr>
-        <w:t>aws configure  # enter your IAM access key, secret key, region: us-east-1</w:t>
+        <w:t>aws configure   # enter IAM access key, secret key, region: us-east-1</w:t>
       </w:r>
     </w:p>
     <w:p>
@@ -2922,7 +3500,7 @@
           <w:b w:val="0"/>
           <w:sz w:val="22"/>
         </w:rPr>
-        <w:t>terraform init</w:t>
+        <w:t>terraform init &amp;&amp; terraform plan &amp;&amp; terraform apply</w:t>
       </w:r>
     </w:p>
     <w:p>
@@ -2935,38 +3513,12 @@
           <w:b w:val="0"/>
           <w:sz w:val="22"/>
         </w:rPr>
-        <w:t>terraform plan</w:t>
+        <w:t>SSH into the instance, clone the repo, and run docker compose up.</w:t>
       </w:r>
     </w:p>
     <w:p>
       <w:pPr>
-        <w:spacing w:after="100"/>
-      </w:pPr>
-      <w:r>
-        <w:rPr>
-          <w:rFonts w:ascii="Calibri" w:hAnsi="Calibri"/>
-          <w:b w:val="0"/>
-          <w:sz w:val="22"/>
-        </w:rPr>
-        <w:t>terraform apply</w:t>
-      </w:r>
-    </w:p>
-    <w:p>
-      <w:pPr>
-        <w:spacing w:after="100"/>
-      </w:pPr>
-      <w:r>
-        <w:rPr>
-          <w:rFonts w:ascii="Calibri" w:hAnsi="Calibri"/>
-          <w:b w:val="0"/>
-          <w:sz w:val="22"/>
-        </w:rPr>
-        <w:t>Terraform outputs the public IP. SSH into the instance and run docker compose up to deploy.</w:t>
-      </w:r>
-    </w:p>
-    <w:p>
-      <w:pPr>
-        <w:spacing w:before="160" w:after="80"/>
+        <w:spacing w:before="200" w:after="80"/>
       </w:pPr>
       <w:r>
         <w:rPr>
@@ -2975,7 +3527,7 @@
           <w:color w:val="1F497D"/>
           <w:sz w:val="26"/>
         </w:rPr>
-        <w:t>4. Simulate the Incident</w:t>
+        <w:t>5. Simulate the Incident</w:t>
       </w:r>
     </w:p>
     <w:p>
@@ -2988,7 +3540,7 @@
           <w:b w:val="0"/>
           <w:sz w:val="22"/>
         </w:rPr>
-        <w:t>In docker-compose.yml, change DB_HOST: postgres  →  DB_HOST: wrong-host</w:t>
+        <w:t>In docker-compose.yml change DB_HOST: postgres  →  DB_HOST: wrong-host</w:t>
       </w:r>
     </w:p>
     <w:p>
@@ -3014,12 +3566,12 @@
           <w:b w:val="0"/>
           <w:sz w:val="22"/>
         </w:rPr>
-        <w:t>Observe Order Service become Unreachable in the dashboard. Check Prometheus for order_errors_total.</w:t>
+        <w:t>Observe Order Service become Unreachable. Check /health for the error message. Watch order_errors_total in Prometheus.</w:t>
       </w:r>
     </w:p>
     <w:p>
       <w:pPr>
-        <w:spacing w:before="160" w:after="80"/>
+        <w:spacing w:before="200" w:after="80"/>
       </w:pPr>
       <w:r>
         <w:rPr>
@@ -3028,7 +3580,7 @@
           <w:color w:val="1F497D"/>
           <w:sz w:val="26"/>
         </w:rPr>
-        <w:t>5. Recover</w:t>
+        <w:t>6. Recover from the Incident</w:t>
       </w:r>
     </w:p>
     <w:p>
@@ -3072,7 +3624,7 @@
     </w:p>
     <w:p>
       <w:pPr>
-        <w:spacing w:before="160" w:after="80"/>
+        <w:spacing w:before="200" w:after="80"/>
       </w:pPr>
       <w:r>
         <w:rPr>
@@ -3081,7 +3633,7 @@
           <w:color w:val="1F497D"/>
           <w:sz w:val="26"/>
         </w:rPr>
-        <w:t>6. Clean Up AWS Resources</w:t>
+        <w:t>7. Clean Up AWS Resources</w:t>
       </w:r>
     </w:p>
     <w:p>
@@ -3107,7 +3659,7 @@
           <w:b w:val="0"/>
           <w:sz w:val="22"/>
         </w:rPr>
-        <w:t>This removes the EC2 instance and security group. Always run this after the assignment to avoid AWS charges.</w:t>
+        <w:t>Always run this after the assignment to avoid ongoing AWS charges.</w:t>
       </w:r>
     </w:p>
     <w:sectPr>

</xml_diff>